<commit_message>
Reformat as Scopus Q1 paper: remove all em dashes, justified Word styling
- Replaced all 112 em dashes with context-appropriate punctuation (commas,
  colons, semicolons, parentheses); preserved en dashes for numeric ranges
- Fixed potential comma-splices with colons; tidied parenthetical asides
- Rebuilt .docx with a journal-style template: Times New Roman, justified
  body (1.15 spacing), centered title, Heading 1/2 hierarchy, TOC field
- All 7 figures embedded; verified 0 em dashes in output

https://claude.ai/code/session_01NaXAP61YbnWJR2PfSHDoxw
</commit_message>
<xml_diff>
--- a/Mary_Magdalene_Narrative_Review.docx
+++ b/Mary_Magdalene_Narrative_Review.docx
@@ -2,6 +2,14 @@
 <file path=word/document.xml><?xml version="1.0" encoding="utf-8"?>
 <w:document xmlns:w="http://schemas.openxmlformats.org/wordprocessingml/2006/main" xmlns:m="http://schemas.openxmlformats.org/officeDocument/2006/math" xmlns:r="http://schemas.openxmlformats.org/officeDocument/2006/relationships" xmlns:o="urn:schemas-microsoft-com:office:office" xmlns:v="urn:schemas-microsoft-com:vml" xmlns:w10="urn:schemas-microsoft-com:office:word" xmlns:a="http://schemas.openxmlformats.org/drawingml/2006/main" xmlns:pic="http://schemas.openxmlformats.org/drawingml/2006/picture" xmlns:wp="http://schemas.openxmlformats.org/drawingml/2006/wordprocessingDrawing">
   <w:body>
+    <w:p>
+      <w:pPr>
+        <w:pStyle w:val="Title"/>
+      </w:pPr>
+      <w:r>
+        <w:t xml:space="preserve">Mary Magdalene and the Memory of Women’s Authority in Early Christianity: Patriarchal Erasure, Heterodox Contestation, and Feminist Reclamation</w:t>
+      </w:r>
+    </w:p>
     <w:sdt>
       <w:sdtPr>
         <w:docPartObj>
@@ -28,15 +36,6 @@
         </w:p>
       </w:sdtContent>
     </w:sdt>
-    <w:bookmarkStart w:id="58" w:name="X6639165cc77ab0069d0cc2cbc96ad6e8bae4bad"/>
-    <w:p>
-      <w:pPr>
-        <w:pStyle w:val="Heading1"/>
-      </w:pPr>
-      <w:r>
-        <w:t xml:space="preserve">Mary Magdalene and the Memory of Women’s Authority in Early Christianity: Patriarchal Erasure, Heterodox Contestation, and Feminist Reclamation</w:t>
-      </w:r>
-    </w:p>
     <w:bookmarkStart w:id="9" w:name="abstract"/>
     <w:p>
       <w:pPr>
@@ -76,7 +75,7 @@
         <w:t xml:space="preserve"> </w:t>
       </w:r>
       <w:r>
-        <w:t xml:space="preserve">Yet for roughly fourteen centuries of Western Christianity she was remembered chiefly as a reformed prostitute—a portrait without foundation in the New Testament. This narrative review synthesises historical-critical, heresiological, and feminist scholarship to argue that Mary Magdalene functions as a privileged site of</w:t>
+        <w:t xml:space="preserve">Yet for roughly fourteen centuries of Western Christianity she was remembered chiefly as a reformed prostitute, a portrait without foundation in the New Testament. This narrative review synthesises historical-critical, heresiological, and feminist scholarship to argue that Mary Magdalene functions as a privileged site of</w:t>
       </w:r>
       <w:r>
         <w:t xml:space="preserve"> </w:t>
@@ -92,7 +91,7 @@
         <w:t xml:space="preserve"> </w:t>
       </w:r>
       <w:r>
-        <w:t xml:space="preserve">in which contests over women’s authority in early Christianity were waged, lost, and—latterly—reopened. The review is organised around three interlocking movements. First,</w:t>
+        <w:t xml:space="preserve">in which contests over women’s authority in early Christianity were waged, lost, and, latterly, reopened. The review is organised around three interlocking movements. First,</w:t>
       </w:r>
       <w:r>
         <w:t xml:space="preserve"> </w:t>
@@ -118,7 +117,7 @@
         <w:t xml:space="preserve">heterodox contestation</w:t>
       </w:r>
       <w:r>
-        <w:t xml:space="preserve">: the prominence of Mary in non-canonical texts—the</w:t>
+        <w:t xml:space="preserve">: the prominence of Mary in non-canonical texts (the</w:t>
       </w:r>
       <w:r>
         <w:t xml:space="preserve"> </w:t>
@@ -170,7 +169,7 @@
         <w:t xml:space="preserve">Pistis Sophia</w:t>
       </w:r>
       <w:r>
-        <w:t xml:space="preserve">—where a recurring Peter-versus-Mary motif dramatises struggles over the basis of legitimate authority. Third,</w:t>
+        <w:t xml:space="preserve">) where a recurring Peter-versus-Mary motif dramatises struggles over the basis of legitimate authority. Third,</w:t>
       </w:r>
       <w:r>
         <w:t xml:space="preserve"> </w:t>
@@ -207,7 +206,7 @@
         <w:t xml:space="preserve"> </w:t>
       </w:r>
       <w:r>
-        <w:t xml:space="preserve">Throughout, the review foregrounds live scholarly disagreements—over the meaning of</w:t>
+        <w:t xml:space="preserve">Throughout, the review foregrounds live scholarly disagreements (over the meaning of</w:t>
       </w:r>
       <w:r>
         <w:t xml:space="preserve"> </w:t>
@@ -260,7 +259,7 @@
         <w:t xml:space="preserve"> </w:t>
       </w:r>
       <w:r>
-        <w:t xml:space="preserve">as a category, and the danger of romanticising heterodox sources as proto-feminist—and argues that the most rigorous reclamation has emerged from feminist scholarship’s own critical self-correction. The Magdalene tradition, it concludes, is best read not as a transparent window onto a historical woman but as a centuries-long argument, conducted in the medium of memory, about who may speak with authority in the name of the risen Christ.</w:t>
+        <w:t xml:space="preserve">as a category, and the danger of romanticising heterodox sources as proto-feminist) and argues that the most rigorous reclamation has emerged from feminist scholarship’s own critical self-correction. The Magdalene tradition, it concludes, is best read not as a transparent window onto a historical woman but as a centuries-long argument, conducted in the medium of memory, about who may speak with authority in the name of the risen Christ.</w:t>
       </w:r>
     </w:p>
     <w:p>
@@ -303,7 +302,7 @@
         <w:pStyle w:val="FirstParagraph"/>
       </w:pPr>
       <w:r>
-        <w:t xml:space="preserve">The history of Mary Magdalene is, to an unusual degree, a history of what was done to her memory. The canonical data are sparse and remarkably consistent: she appears by name some twelve times across the four Gospels, almost always at the decisive hinge of the Passion and resurrection narratives, and almost always at the head of the lists of women who remained when the male disciples had fled (Mark 15:40, 15:47; Matthew 27:56, 27:61; Luke 24:10; John 19:25; 20:1–18). She is, on any reading of Matthew and John, the first witness to the empty tomb and the first to encounter the risen Jesus; in the Fourth Gospel she is explicitly sent—</w:t>
+        <w:t xml:space="preserve">The history of Mary Magdalene is, to an unusual degree, a history of what was done to her memory. The canonical data are sparse and remarkably consistent: she appears by name some twelve times across the four Gospels, almost always at the decisive hinge of the Passion and resurrection narratives, and almost always at the head of the lists of women who remained when the male disciples had fled (Mark 15:40, 15:47; Matthew 27:56, 27:61; Luke 24:10; John 19:25; 20:1–18). She is, on any reading of Matthew and John, the first witness to the empty tomb and the first to encounter the risen Jesus; in the Fourth Gospel she is explicitly sent (</w:t>
       </w:r>
       <w:r>
         <w:rPr>
@@ -325,7 +324,7 @@
         <w:t xml:space="preserve"> </w:t>
       </w:r>
       <w:r>
-        <w:t xml:space="preserve">is formed—to announce the resurrection to the male disciples (John 20:17–18). And yet, in the cultural memory of the Latin West, none of this is what she became. She became the penitent whore: the weeping woman with the alabaster jar and the loosened hair, the patron saint of the reformed prostitute, the very emblem of fallen and redeemed female sexuality.</w:t>
+        <w:t xml:space="preserve">is formed) to announce the resurrection to the male disciples (John 20:17–18). And yet, in the cultural memory of the Latin West, none of this is what she became. She became the penitent whore: the weeping woman with the alabaster jar and the loosened hair, the patron saint of the reformed prostitute, the very emblem of fallen and redeemed female sexuality.</w:t>
       </w:r>
     </w:p>
     <w:p>
@@ -358,7 +357,7 @@
         <w:t xml:space="preserve">cultural memory</w:t>
       </w:r>
       <w:r>
-        <w:t xml:space="preserve">: the socially organised, institutionally transmitted, and constantly renegotiated work by which a community decides what its past means and who within that past may count as an authority. The title of this review—and of the tradition it surveys—names three successive operations performed upon that memory.</w:t>
+        <w:t xml:space="preserve">: the socially organised, institutionally transmitted, and constantly renegotiated work by which a community decides what its past means and who within that past may count as an authority. The title of this review, and of the tradition it surveys, names three successive operations performed upon that memory.</w:t>
       </w:r>
       <w:r>
         <w:t xml:space="preserve"> </w:t>
@@ -406,7 +405,7 @@
         <w:t xml:space="preserve"> </w:t>
       </w:r>
       <w:r>
-        <w:t xml:space="preserve">describes the modern feminist project of recovering both Mary and the wider history of women’s authority—a project that has had to reckon, with increasing sophistication, with the limits of its own sources.</w:t>
+        <w:t xml:space="preserve">describes the modern feminist project of recovering both Mary and the wider history of women’s authority, a project that has had to reckon, with increasing sophistication, with the limits of its own sources.</w:t>
       </w:r>
     </w:p>
     <w:p>
@@ -454,7 +453,7 @@
         <w:t xml:space="preserve"> </w:t>
       </w:r>
       <w:r>
-        <w:t xml:space="preserve">is left unnamed in Mark and Matthew, while the betrayer beside her is named; the promise of remembrance is, as she puts it, forgotten along with the woman’s name. Mary Magdalene is the figure on whom that forgetting was, paradoxically, most lavishly inscribed—and around whom the labour of re-remembering has been most concentrated.</w:t>
+        <w:t xml:space="preserve">is left unnamed in Mark and Matthew, while the betrayer beside her is named; the promise of remembrance is, as she puts it, forgotten along with the woman’s name. Mary Magdalene is the figure on whom that forgetting was, paradoxically, most lavishly inscribed, and around whom the labour of re-remembering has been most concentrated.</w:t>
       </w:r>
     </w:p>
     <w:p>
@@ -553,7 +552,7 @@
         <w:t xml:space="preserve"> </w:t>
       </w:r>
       <w:r>
-        <w:t xml:space="preserve">of the memory—what the earliest sources do and do not say, and what historical-critical scholarship can responsibly reconstruct about the woman from Magdala. Section 4 examines patriarchal erasure, both in the specific case of Mary’s</w:t>
+        <w:t xml:space="preserve">of the memory, what the earliest sources do and do not say, and what historical-critical scholarship can responsibly reconstruct about the woman from Magdala. Section 4 examines patriarchal erasure, both in the specific case of Mary’s</w:t>
       </w:r>
       <w:r>
         <w:t xml:space="preserve"> </w:t>
@@ -565,7 +564,7 @@
         <w:t xml:space="preserve"> </w:t>
       </w:r>
       <w:r>
-        <w:t xml:space="preserve">and in the cognate mechanisms—the Junia tradition, the Pastoral Epistles, the household codes—by which women’s authority was constrained. Section 5 turns to the heterodox counter-tradition and the Peter-versus-Mary motif, while taking seriously the methodological cautions that now attend the terms</w:t>
+        <w:t xml:space="preserve">and in the cognate mechanisms (the Junia tradition, the Pastoral Epistles, the household codes) by which women’s authority was constrained. Section 5 turns to the heterodox counter-tradition and the Peter-versus-Mary motif, while taking seriously the methodological cautions that now attend the terms</w:t>
       </w:r>
       <w:r>
         <w:t xml:space="preserve"> </w:t>
@@ -607,7 +606,7 @@
         <w:pStyle w:val="FirstParagraph"/>
       </w:pPr>
       <w:r>
-        <w:t xml:space="preserve">This is a narrative—rather than systematic—review, appropriate to a body of scholarship that is interpretive, cross-disciplinary, and irreducibly contested. It draws together five literatures that are too rarely read against one another: New Testament historical criticism; patristics and the history of biblical interpretation (</w:t>
+        <w:t xml:space="preserve">This is a narrative, rather than systematic, review, appropriate to a body of scholarship that is interpretive, cross-disciplinary, and irreducibly contested. It draws together five literatures that are too rarely read against one another: New Testament historical criticism; patristics and the history of biblical interpretation (</w:t>
       </w:r>
       <w:r>
         <w:rPr>
@@ -745,7 +744,7 @@
         <w:t xml:space="preserve">memory</w:t>
       </w:r>
       <w:r>
-        <w:t xml:space="preserve">. Much of the most influential writing on Mary Magdalene—Schaberg’s</w:t>
+        <w:t xml:space="preserve">. Much of the most influential writing on Mary Magdalene (Schaberg’s</w:t>
       </w:r>
       <w:r>
         <w:t xml:space="preserve"> </w:t>
@@ -766,7 +765,7 @@
         <w:t xml:space="preserve">“suppressed Gnostic feminism”</w:t>
       </w:r>
       <w:r>
-        <w:t xml:space="preserve">—operates at the level of historical reconstruction, claiming to recover a suppressed past. A more cautious recent scholarship (D’Angelo, Brock, Shoemaker) insists that the figure of Mary in the sources is frequently a rhetorical cipher in disputes over authority rather than a transparent record of a historical woman. This review treats that tension not as an obstacle to be resolved but as itself the principal finding: the Magdalene tradition is most illuminating when read as a history of contested memory.</w:t>
+        <w:t xml:space="preserve">) operates at the level of historical reconstruction, claiming to recover a suppressed past. A more cautious recent scholarship (D’Angelo, Brock, Shoemaker) insists that the figure of Mary in the sources is frequently a rhetorical cipher in disputes over authority rather than a transparent record of a historical woman. This review treats that tension not as an obstacle to be resolved but as itself the principal finding: the Magdalene tradition is most illuminating when read as a history of contested memory.</w:t>
       </w:r>
     </w:p>
     <w:p>
@@ -774,7 +773,7 @@
         <w:pStyle w:val="BodyText"/>
       </w:pPr>
       <w:r>
-        <w:t xml:space="preserve">The second commitment is to flag disagreement rather than smooth it. At every stage—the meaning of</w:t>
+        <w:t xml:space="preserve">The second commitment is to flag disagreement rather than smooth it. At every stage (the meaning of</w:t>
       </w:r>
       <w:r>
         <w:t xml:space="preserve"> </w:t>
@@ -855,7 +854,7 @@
         <w:t xml:space="preserve"> </w:t>
       </w:r>
       <w:r>
-        <w:t xml:space="preserve">itself—the secondary literature is genuinely divided. These divisions are reported as such. Where a claim rests on the reconstruction of a single influential scholar, that provenance is named.</w:t>
+        <w:t xml:space="preserve">itself) the secondary literature is genuinely divided. These divisions are reported as such. Where a claim rests on the reconstruction of a single influential scholar, that provenance is named.</w:t>
       </w:r>
     </w:p>
     <w:p>
@@ -863,7 +862,7 @@
         <w:pStyle w:val="BodyText"/>
       </w:pPr>
       <w:r>
-        <w:t xml:space="preserve">A note on sources is in order. The primary texts cited below—the canonical Gospels, the Nag Hammadi and Berlin Codex tractates, the patristic corpus, the conciliar canons, and the relevant inscriptions—are quoted from the standard critical and translation editions identified in the references, and exact wording (especially of the heterodox texts, which survive in lacunose and translation-dependent states) should always be checked against those editions, since English renderings vary materially.</w:t>
+        <w:t xml:space="preserve">A note on sources is in order. The primary texts cited below (the canonical Gospels, the Nag Hammadi and Berlin Codex tractates, the patristic corpus, the conciliar canons, and the relevant inscriptions) are quoted from the standard critical and translation editions identified in the references, and exact wording (especially of the heterodox texts, which survive in lacunose and translation-dependent states) should always be checked against those editions, since English renderings vary materially.</w:t>
       </w:r>
     </w:p>
     <w:bookmarkEnd w:id="17"/>
@@ -914,7 +913,7 @@
         <w:t xml:space="preserve"> </w:t>
       </w:r>
       <w:r>
-        <w:t xml:space="preserve">(Mark 16:9)—though this verse belongs to a secondary ending absent from the earliest manuscripts and cannot bear independent historical weight.</w:t>
+        <w:t xml:space="preserve">(Mark 16:9), though this verse belongs to a secondary ending absent from the earliest manuscripts and cannot bear independent historical weight.</w:t>
       </w:r>
     </w:p>
     <w:p>
@@ -1029,7 +1028,7 @@
         <w:pStyle w:val="BodyText"/>
       </w:pPr>
       <w:r>
-        <w:t xml:space="preserve">It is the Johannine narrative that does most to establish her later honorific. In John 20:1–18 Mary alone discovers the empty tomb, alone encounters the risen Lord—whom she at first mistakes for the gardener—and is commissioned by him with the words</w:t>
+        <w:t xml:space="preserve">It is the Johannine narrative that does most to establish her later honorific. In John 20:1–18 Mary alone discovers the empty tomb, alone encounters the risen Lord, whom she at first mistakes for the gardener, and is commissioned by him with the words</w:t>
       </w:r>
       <w:r>
         <w:t xml:space="preserve"> </w:t>
@@ -1053,7 +1052,7 @@
         <w:t xml:space="preserve"> </w:t>
       </w:r>
       <w:r>
-        <w:t xml:space="preserve">(John 20:18), makes her the first human being charged with proclaiming the resurrection. On the standard early-Christian criterion for apostleship—a resurrection appearance coupled with a commission to proclaim it—Mary Magdalene qualifies, a point to which the feminist reclamation would later return with force.</w:t>
+        <w:t xml:space="preserve">(John 20:18), makes her the first human being charged with proclaiming the resurrection. On the standard early-Christian criterion for apostleship (a resurrection appearance coupled with a commission to proclaim it), Mary Magdalene qualifies, a point to which the feminist reclamation would later return with force.</w:t>
       </w:r>
     </w:p>
     <w:p>
@@ -1073,7 +1072,7 @@
         <w:t xml:space="preserve"> </w:t>
       </w:r>
       <w:r>
-        <w:t xml:space="preserve">indicating that these women were patrons—of independent means—rather than dependents. The same passage supplies the notice that seven demons</w:t>
+        <w:t xml:space="preserve">indicating that these women were patrons, of independent means, rather than dependents. The same passage supplies the notice that seven demons</w:t>
       </w:r>
       <w:r>
         <w:t xml:space="preserve"> </w:t>
@@ -1109,7 +1108,7 @@
         <w:t xml:space="preserve"> </w:t>
       </w:r>
       <w:r>
-        <w:t xml:space="preserve">is disputed—Bart Ehrman takes it as symbolic of completeness (she was wholly overwhelmed), while Bruce Chilton suggests successive exorcisms—but no reading internal to Luke associates it with prostitution.</w:t>
+        <w:t xml:space="preserve">is disputed: Bart Ehrman takes it as symbolic of completeness (she was wholly overwhelmed), while Bruce Chilton suggests successive exorcisms, but no reading internal to Luke associates it with prostitution.</w:t>
       </w:r>
     </w:p>
     <w:bookmarkEnd w:id="21"/>
@@ -1140,7 +1139,7 @@
         <w:pStyle w:val="FirstParagraph"/>
       </w:pPr>
       <w:r>
-        <w:t xml:space="preserve">The title by which Mary Magdalene was known through much of the tradition—</w:t>
+        <w:t xml:space="preserve">The title by which Mary Magdalene was known through much of the tradition (</w:t>
       </w:r>
       <w:r>
         <w:rPr>
@@ -1159,7 +1158,7 @@
         <w:t xml:space="preserve">“apostle to the apostles”</w:t>
       </w:r>
       <w:r>
-        <w:t xml:space="preserve">—has a longer and more layered history than is often appreciated. Its conceptual root lies in the third century: Hippolytus of Rome (c. 170–235), in his</w:t>
+        <w:t xml:space="preserve">) has a longer and more layered history than is often appreciated. Its conceptual root lies in the third century: Hippolytus of Rome (c. 170–235), in his</w:t>
       </w:r>
       <w:r>
         <w:t xml:space="preserve"> </w:t>
@@ -1184,7 +1183,7 @@
         <w:t xml:space="preserve"> </w:t>
       </w:r>
       <w:r>
-        <w:t xml:space="preserve">sent by Christ, and adds the striking exclamation that Eve has become an apostle—though he applies the language to the women collectively rather than uniquely titling Mary. The fixed Latin title, however, is a high-medieval coinage. It is sometimes traced to the</w:t>
+        <w:t xml:space="preserve">sent by Christ, and adds the striking exclamation that Eve has become an apostle, though he applies the language to the women collectively rather than uniquely titling Mary. The fixed Latin title, however, is a high-medieval coinage. It is sometimes traced to the</w:t>
       </w:r>
       <w:r>
         <w:t xml:space="preserve"> </w:t>
@@ -1252,7 +1251,10 @@
         <w:t xml:space="preserve"> </w:t>
       </w:r>
       <w:r>
-        <w:t xml:space="preserve">as a toponymic—</w:t>
+        <w:t xml:space="preserve">as a toponymic,</w:t>
+      </w:r>
+      <w:r>
+        <w:t xml:space="preserve"> </w:t>
       </w:r>
       <w:r>
         <w:t xml:space="preserve">“the woman from Magdala,”</w:t>
@@ -1317,7 +1319,7 @@
         <w:t xml:space="preserve">“Magdala Stone”</w:t>
       </w:r>
       <w:r>
-        <w:t xml:space="preserve">), paved streets, a marketplace, ritual baths, and an industrial fish-processing complex. That Mary is identified by town rather than by husband or father—and that Luke lists her as a patron—has led Jane Schaberg and others to infer a woman of independent social and economic standing, the antithesis of the later penitent.</w:t>
+        <w:t xml:space="preserve">), paved streets, a marketplace, ritual baths, and an industrial fish-processing complex. That Mary is identified by town rather than by husband or father, and that Luke lists her as a patron, has led Jane Schaberg and others to infer a woman of independent social and economic standing, the antithesis of the later penitent.</w:t>
       </w:r>
     </w:p>
     <w:p>
@@ -1350,7 +1352,7 @@
         <w:t xml:space="preserve"> </w:t>
       </w:r>
       <w:r>
-        <w:t xml:space="preserve">may be an honorific—</w:t>
+        <w:t xml:space="preserve">may be an honorific (</w:t>
       </w:r>
       <w:r>
         <w:t xml:space="preserve">“the Tower-ess,”</w:t>
@@ -1381,7 +1383,7 @@
         <w:t xml:space="preserve">“tower”</w:t>
       </w:r>
       <w:r>
-        <w:t xml:space="preserve">—rather than a place of origin, noting that a town called simply</w:t>
+        <w:t xml:space="preserve">) rather than a place of origin, noting that a town called simply</w:t>
       </w:r>
       <w:r>
         <w:t xml:space="preserve"> </w:t>
@@ -1528,7 +1530,7 @@
         <w:t xml:space="preserve"> </w:t>
       </w:r>
       <w:r>
-        <w:t xml:space="preserve">supplying the sexual charge that the text of Luke 7—which calls the woman only</w:t>
+        <w:t xml:space="preserve">supplying the sexual charge that the text of Luke 7 (which calls the woman only</w:t>
       </w:r>
       <w:r>
         <w:t xml:space="preserve"> </w:t>
@@ -1553,7 +1555,7 @@
         <w:t xml:space="preserve"> </w:t>
       </w:r>
       <w:r>
-        <w:t xml:space="preserve">with no mention of prostitution—does not contain.</w:t>
+        <w:t xml:space="preserve">with no mention of prostitution) does not contain.</w:t>
       </w:r>
     </w:p>
     <w:p>
@@ -1744,7 +1746,7 @@
         <w:t xml:space="preserve"> </w:t>
       </w:r>
       <w:r>
-        <w:t xml:space="preserve">by which a leading female disciple and resurrection witness was recast as a redeemed prostitute, and reconstructs—at the level of memory and counter-memory—a suppressed</w:t>
+        <w:t xml:space="preserve">by which a leading female disciple and resurrection witness was recast as a redeemed prostitute, and reconstructs, at the level of memory and counter-memory, a suppressed</w:t>
       </w:r>
       <w:r>
         <w:t xml:space="preserve"> </w:t>
@@ -1788,7 +1790,7 @@
         <w:t xml:space="preserve"> </w:t>
       </w:r>
       <w:r>
-        <w:t xml:space="preserve">and not the sinful woman or Mary of Bethany—though, as careful commentators note, this corrected the liturgical</w:t>
+        <w:t xml:space="preserve">and not the sinful woman or Mary of Bethany, though, as careful commentators note, this corrected the liturgical</w:t>
       </w:r>
       <w:r>
         <w:t xml:space="preserve"> </w:t>
@@ -1817,7 +1819,7 @@
         <w:t xml:space="preserve">feast</w:t>
       </w:r>
       <w:r>
-        <w:t xml:space="preserve">—the same rank accorded the apostles—with an accompanying article by Archbishop Arthur Roche titled</w:t>
+        <w:t xml:space="preserve">, the same rank accorded the apostles, with an accompanying article by Archbishop Arthur Roche titled</w:t>
       </w:r>
       <w:r>
         <w:t xml:space="preserve"> </w:t>
@@ -1914,7 +1916,10 @@
         <w:t xml:space="preserve"> </w:t>
       </w:r>
       <w:r>
-        <w:t xml:space="preserve">and pro-hierarchical of the canonical Gospels. It promotes the narrowest and most formal concept of apostleship, and it is alone among the four in having the risen Lord appear first to Peter—</w:t>
+        <w:t xml:space="preserve">and pro-hierarchical of the canonical Gospels. It promotes the narrowest and most formal concept of apostleship, and it is alone among the four in having the risen Lord appear first to Peter,</w:t>
+      </w:r>
+      <w:r>
+        <w:t xml:space="preserve"> </w:t>
       </w:r>
       <w:r>
         <w:t xml:space="preserve">“The Lord has risen indeed, and has appeared to Simon!”</w:t>
@@ -1923,7 +1928,7 @@
         <w:t xml:space="preserve"> </w:t>
       </w:r>
       <w:r>
-        <w:t xml:space="preserve">(Luke 24:34)—while omitting any resurrection appearance to Mary Magdalene. This parallels the pre-Pauline creedal formula of 1 Corinthians 15:5,</w:t>
+        <w:t xml:space="preserve">(Luke 24:34), while omitting any resurrection appearance to Mary Magdalene. This parallels the pre-Pauline creedal formula of 1 Corinthians 15:5,</w:t>
       </w:r>
       <w:r>
         <w:t xml:space="preserve"> </w:t>
@@ -1935,7 +1940,7 @@
         <w:t xml:space="preserve"> </w:t>
       </w:r>
       <w:r>
-        <w:t xml:space="preserve">which likewise passes over the women whom the Gospel narratives place first at the tomb. The textual facts are not in dispute; the interpretive weight Brock places on them—as evidence of a deliberate elevation of Petrine over Magdalene authority—is her contribution to a now-influential reading.</w:t>
+        <w:t xml:space="preserve">which likewise passes over the women whom the Gospel narratives place first at the tomb. The textual facts are not in dispute; the interpretive weight Brock places on them, as evidence of a deliberate elevation of Petrine over Magdalene authority, is her contribution to a now-influential reading.</w:t>
       </w:r>
     </w:p>
     <w:bookmarkEnd w:id="29"/>
@@ -1997,7 +2002,7 @@
         <w:t xml:space="preserve"> </w:t>
       </w:r>
       <w:r>
-        <w:t xml:space="preserve">was common in the Greco-Roman world—attested, by Epp’s count, hundreds of times—while the masculine</w:t>
+        <w:t xml:space="preserve">was common in the Greco-Roman world (attested, by Epp’s count, hundreds of times) while the masculine</w:t>
       </w:r>
       <w:r>
         <w:t xml:space="preserve"> </w:t>
@@ -2209,7 +2214,7 @@
         <w:t xml:space="preserve"> </w:t>
       </w:r>
       <w:r>
-        <w:t xml:space="preserve">from 1898 until its thirteenth edition of 1927, when—without new manuscript evidence—the editors switched to the masculine</w:t>
+        <w:t xml:space="preserve">from 1898 until its thirteenth edition of 1927, when, without new manuscript evidence, the editors switched to the masculine</w:t>
       </w:r>
       <w:r>
         <w:t xml:space="preserve"> </w:t>
@@ -2261,7 +2266,7 @@
         <w:t xml:space="preserve"> </w:t>
       </w:r>
       <w:r>
-        <w:t xml:space="preserve">(so that Junia is herself an apostle—Epp, Bauckham) or</w:t>
+        <w:t xml:space="preserve">(so that Junia is herself an apostle, with Epp and Bauckham) or</w:t>
       </w:r>
       <w:r>
         <w:t xml:space="preserve"> </w:t>
@@ -2273,7 +2278,7 @@
         <w:t xml:space="preserve"> </w:t>
       </w:r>
       <w:r>
-        <w:t xml:space="preserve">(so that she is not—Burer and Wallace). The second concerns motive: Epp implies ideological suppression, whereas some textual critics attribute the 1927 change to an unexamined grammatical assumption that the name must be a contracted masculine form. The</w:t>
+        <w:t xml:space="preserve">(so that she is not, with Burer and Wallace). The second concerns motive: Epp implies ideological suppression, whereas some textual critics attribute the 1927 change to an unexamined grammatical assumption that the name must be a contracted masculine form. The</w:t>
       </w:r>
       <w:r>
         <w:t xml:space="preserve"> </w:t>
@@ -2331,7 +2336,7 @@
         <w:t xml:space="preserve"> </w:t>
       </w:r>
       <w:r>
-        <w:t xml:space="preserve">grounding the prohibition in the creation order and Eve’s deception—the principal proof-text in later debates over women’s ordination.</w:t>
+        <w:t xml:space="preserve">grounding the prohibition in the creation order and Eve’s deception, the principal proof-text in later debates over women’s ordination.</w:t>
       </w:r>
     </w:p>
     <w:p>
@@ -2363,7 +2368,7 @@
         <w:t xml:space="preserve"> </w:t>
       </w:r>
       <w:r>
-        <w:t xml:space="preserve">to a different position after verse 40 in part of the Western manuscript tradition. The debate is genuinely unresolved—no extant manuscript omits the verses entirely, which weakens the interpolation hypothesis—and alternative readings (a quotation Paul then refutes; a narrowly limited prohibition) remain in play. The passage is best presented as contested rather than settled.</w:t>
+        <w:t xml:space="preserve">to a different position after verse 40 in part of the Western manuscript tradition. The debate is genuinely unresolved (no extant manuscript omits the verses entirely, which weakens the interpolation hypothesis) and alternative readings (a quotation Paul then refutes; a narrowly limited prohibition) remain in play. The passage is best presented as contested rather than settled.</w:t>
       </w:r>
     </w:p>
     <w:p>
@@ -2387,7 +2392,7 @@
         <w:t xml:space="preserve"> </w:t>
       </w:r>
       <w:r>
-        <w:t xml:space="preserve">or household codes (Colossians 3:18–4:1; Ephesians 5:21–6:9; 1 Peter 2:13–3:7) adapt the Greco-Roman tradition of household management, with its paired instructions for husbands and wives, masters and slaves, parents and children, and enjoin the subordination of wives—even as Ephesians frames its code with the reciprocal</w:t>
+        <w:t xml:space="preserve">or household codes (Colossians 3:18–4:1; Ephesians 5:21–6:9; 1 Peter 2:13–3:7) adapt the Greco-Roman tradition of household management, with its paired instructions for husbands and wives, masters and slaves, parents and children, and enjoin the subordination of wives, even as Ephesians frames its code with the reciprocal</w:t>
       </w:r>
       <w:r>
         <w:t xml:space="preserve"> </w:t>
@@ -2411,7 +2416,7 @@
         <w:t xml:space="preserve"> </w:t>
       </w:r>
       <w:r>
-        <w:t xml:space="preserve">of the earliest movement was progressively supplanted, across the second and third centuries, by a hierarchical and patriarchal ecclesial order—a</w:t>
+        <w:t xml:space="preserve">of the earliest movement was progressively supplanted, across the second and third centuries, by a hierarchical and patriarchal ecclesial order, a</w:t>
       </w:r>
       <w:r>
         <w:t xml:space="preserve"> </w:t>
@@ -2460,7 +2465,7 @@
         <w:t xml:space="preserve"> </w:t>
       </w:r>
       <w:r>
-        <w:t xml:space="preserve">“You are the devil’s gateway … you are the first deserter of the divine law … on account of your desert—that is, death—even the Son of God had to die.”</w:t>
+        <w:t xml:space="preserve">“You are the devil’s gateway … you are the first deserter of the divine law … on account of your desert (that is, death) even the Son of God had to die.”</w:t>
       </w:r>
       <w:r>
         <w:t xml:space="preserve"> </w:t>
@@ -2547,7 +2552,7 @@
         <w:t xml:space="preserve">Gospel of Mary</w:t>
       </w:r>
       <w:r>
-        <w:t xml:space="preserve">, was purchased in Cairo in 1896 but—delayed by two world wars—was not published until 1955. The transformative find came in December 1945 near Nag Hammadi in Upper Egypt, where a sealed jar yielded thirteen leather-bound papyrus codices preserving fifty-two tractates in Coptic (some of them duplicates, for roughly forty-five to forty-six distinct works). For the first time, scholars could read the so-called heterodox Christianities in their own voice rather than through the hostile summaries of the heresiologists, and the cumulative effect was to force a recognition that earliest Christianity was far more diverse than the later orthodox narrative allowed.</w:t>
+        <w:t xml:space="preserve">, was purchased in Cairo in 1896 but, delayed by two world wars, was not published until 1955. The transformative find came in December 1945 near Nag Hammadi in Upper Egypt, where a sealed jar yielded thirteen leather-bound papyrus codices preserving fifty-two tractates in Coptic (some of them duplicates, for roughly forty-five to forty-six distinct works). For the first time, scholars could read the so-called heterodox Christianities in their own voice rather than through the hostile summaries of the heresiologists, and the cumulative effect was to force a recognition that earliest Christianity was far more diverse than the later orthodox narrative allowed.</w:t>
       </w:r>
     </w:p>
     <w:p>
@@ -2639,7 +2644,7 @@
         <w:t xml:space="preserve"> </w:t>
       </w:r>
       <w:r>
-        <w:t xml:space="preserve">is the only early Christian gospel attributed to a woman. Composed in Greek, probably in the first half of the second century, it survives in a fragmentary fifth-century Coptic copy (the Berlin Codex) supplemented by two third-century Greek fragments, Papyrus Rylands 463 and Papyrus Oxyrhynchus 3525. Roughly half the text is lost—pages 1–6 and 11–14 of the Coptic codex are missing—so that the surviving narrative opens in the middle of a post-resurrection dialogue. After the risen Saviour departs and the disciples are left fearful, Mary comforts them and relays a private teaching she has received concerning the soul’s ascent past the hostile cosmic powers.</w:t>
+        <w:t xml:space="preserve">is the only early Christian gospel attributed to a woman. Composed in Greek, probably in the first half of the second century, it survives in a fragmentary fifth-century Coptic copy (the Berlin Codex) supplemented by two third-century Greek fragments, Papyrus Rylands 463 and Papyrus Oxyrhynchus 3525. Roughly half the text is lost: pages 1–6 and 11–14 of the Coptic codex are missing, so that the surviving narrative opens in the middle of a post-resurrection dialogue. After the risen Saviour departs and the disciples are left fearful, Mary comforts them and relays a private teaching she has received concerning the soul’s ascent past the hostile cosmic powers.</w:t>
       </w:r>
     </w:p>
     <w:p>
@@ -2750,7 +2755,7 @@
           <w:i/>
           <w:iCs/>
         </w:rPr>
-        <w:t xml:space="preserve">— a recurring cipher for contests between charismatic-revelatory and institutional-apostolic authority.</w:t>
+        <w:t xml:space="preserve">, a recurring cipher for contests between charismatic-revelatory and institutional-apostolic authority.</w:t>
       </w:r>
     </w:p>
     <w:p>
@@ -2861,7 +2866,7 @@
         <w:t xml:space="preserve"> </w:t>
       </w:r>
       <w:r>
-        <w:t xml:space="preserve">(κοινωνός) of the Saviour—a term meaning</w:t>
+        <w:t xml:space="preserve">(κοινωνός) of the Saviour, a term meaning</w:t>
       </w:r>
       <w:r>
         <w:t xml:space="preserve"> </w:t>
@@ -2933,7 +2938,7 @@
         <w:t xml:space="preserve"> </w:t>
       </w:r>
       <w:r>
-        <w:t xml:space="preserve">“kiss her on her ——,”</w:t>
+        <w:t xml:space="preserve">“kiss her on her […],”</w:t>
       </w:r>
       <w:r>
         <w:t xml:space="preserve"> </w:t>
@@ -2973,7 +2978,7 @@
         <w:t xml:space="preserve">logos</w:t>
       </w:r>
       <w:r>
-        <w:t xml:space="preserve">—the text elsewhere treats kissing as the means by which</w:t>
+        <w:t xml:space="preserve">, the text elsewhere treats kissing as the means by which</w:t>
       </w:r>
       <w:r>
         <w:t xml:space="preserve"> </w:t>
@@ -2982,7 +2987,7 @@
         <w:t xml:space="preserve">“the perfect conceive and give birth”</w:t>
       </w:r>
       <w:r>
-        <w:t xml:space="preserve">—rather than an erotic or marital datum. Bart Ehrman and others caution explicitly against reading the passage as evidence of a marriage between Jesus and Mary. The</w:t>
+        <w:t xml:space="preserve">, rather than an erotic or marital datum. Bart Ehrman and others caution explicitly against reading the passage as evidence of a marriage between Jesus and Mary. The</w:t>
       </w:r>
       <w:r>
         <w:t xml:space="preserve"> </w:t>
@@ -3045,7 +3050,10 @@
         <w:t xml:space="preserve">Gospel of Thomas</w:t>
       </w:r>
       <w:r>
-        <w:t xml:space="preserve">—preserved complete in Coptic in Nag Hammadi Codex II and partially in three earlier Greek Oxyrhynchus fragments, with its date of composition disputed across a wide range from the mid-first to the mid-second century—supplies the single most important caution against any simple reading of the heterodox tradition as pro-woman. Its closing saying, logion 114, runs:</w:t>
+        <w:t xml:space="preserve"> </w:t>
+      </w:r>
+      <w:r>
+        <w:t xml:space="preserve">(preserved complete in Coptic in Nag Hammadi Codex II and partially in three earlier Greek Oxyrhynchus fragments, with its date of composition disputed across a wide range from the mid-first to the mid-second century) supplies the single most important caution against any simple reading of the heterodox tradition as pro-woman. Its closing saying, logion 114, runs:</w:t>
       </w:r>
     </w:p>
     <w:p>
@@ -3181,7 +3189,7 @@
         <w:t xml:space="preserve"> </w:t>
       </w:r>
       <w:r>
-        <w:t xml:space="preserve">Jesus repeatedly affirms her. The same configuration—Mary as the privileged recipient of revelation, her authority resented and contested—recurs across the</w:t>
+        <w:t xml:space="preserve">Jesus repeatedly affirms her. The same configuration (Mary as the privileged recipient of revelation, her authority resented and contested) recurs across the</w:t>
       </w:r>
       <w:r>
         <w:t xml:space="preserve"> </w:t>
@@ -3468,7 +3476,7 @@
         <w:t xml:space="preserve">“a rhetorical artefact”</w:t>
       </w:r>
       <w:r>
-        <w:t xml:space="preserve">—a reification of the heresiological rhetoric by which the early orthodox defined themselves against their rivals—and must be disentangled from historiography. The consequence for the present subject is sharp and, as the next section shows, was drawn by feminist scholars themselves: if</w:t>
+        <w:t xml:space="preserve">, a reification of the heresiological rhetoric by which the early orthodox defined themselves against their rivals, and must be disentangled from historiography. The consequence for the present subject is sharp and, as the next section shows, was drawn by feminist scholars themselves: if</w:t>
       </w:r>
       <w:r>
         <w:t xml:space="preserve"> </w:t>
@@ -3513,13 +3521,13 @@
     </w:p>
     <w:bookmarkEnd w:id="45"/>
     <w:bookmarkEnd w:id="46"/>
-    <w:bookmarkStart w:id="51" w:name="X1331e074b3224938e862e62f76af6f8dc148a58"/>
+    <w:bookmarkStart w:id="51" w:name="X9f661a7dbde581cbbbabbb5da18cc93ec314014"/>
     <w:p>
       <w:pPr>
         <w:pStyle w:val="Heading2"/>
       </w:pPr>
       <w:r>
-        <w:t xml:space="preserve">6. Feminist reclamation—and its self-correction</w:t>
+        <w:t xml:space="preserve">6. Feminist Reclamation and Its Self-Correction</w:t>
       </w:r>
     </w:p>
     <w:bookmarkStart w:id="47" w:name="Xad0aaa18e9bb563dc6d8d4dc92482d7181c7fde"/>
@@ -3561,7 +3569,10 @@
         <w:t xml:space="preserve">“discipleship of equals”</w:t>
       </w:r>
       <w:r>
-        <w:t xml:space="preserve">—a charismatic, egalitarian community in which women exercised genuine leadership—and that this ethos was progressively suppressed by the hierarchical, patriarchal structures of the post-apostolic church. Methodologically, the book offered the first comprehensive articulation of a feminist critical hermeneutic, pairing a</w:t>
+        <w:t xml:space="preserve"> </w:t>
+      </w:r>
+      <w:r>
+        <w:t xml:space="preserve">(a charismatic, egalitarian community in which women exercised genuine leadership) and that this ethos was progressively suppressed by the hierarchical, patriarchal structures of the post-apostolic church. Methodologically, the book offered the first comprehensive articulation of a feminist critical hermeneutic, pairing a</w:t>
       </w:r>
       <w:r>
         <w:t xml:space="preserve"> </w:t>
@@ -3605,7 +3616,7 @@
         <w:t xml:space="preserve"> </w:t>
       </w:r>
       <w:r>
-        <w:t xml:space="preserve">of women’s agency that those texts obscure). Schüssler Fiorenza’s later work added further moments—proclamation, imagination, ritualisation—so that the often-cited</w:t>
+        <w:t xml:space="preserve">of women’s agency that those texts obscure). Schüssler Fiorenza’s later work added further moments (proclamation, imagination, ritualisation) so that the often-cited</w:t>
       </w:r>
       <w:r>
         <w:t xml:space="preserve"> </w:t>
@@ -3617,7 +3628,7 @@
         <w:t xml:space="preserve"> </w:t>
       </w:r>
       <w:r>
-        <w:t xml:space="preserve">typology of feminist interpretation is better described as a flexible family of strategies than a fixed enumeration. Her coinages—the</w:t>
+        <w:t xml:space="preserve">typology of feminist interpretation is better described as a flexible family of strategies than a fixed enumeration. Her coinages (the</w:t>
       </w:r>
       <w:r>
         <w:t xml:space="preserve"> </w:t>
@@ -3641,7 +3652,7 @@
         <w:t xml:space="preserve"> </w:t>
       </w:r>
       <w:r>
-        <w:t xml:space="preserve">as an unstable category that also embraces other marginalised persons—became part of the field’s basic vocabulary. Crucially, she had already, in a 1974 essay, named Mary Magdalene</w:t>
+        <w:t xml:space="preserve">as an unstable category that also embraces other marginalised persons) became part of the field’s basic vocabulary. Crucially, she had already, in a 1974 essay, named Mary Magdalene</w:t>
       </w:r>
       <w:r>
         <w:t xml:space="preserve"> </w:t>
@@ -3687,7 +3698,7 @@
         <w:t xml:space="preserve"> </w:t>
       </w:r>
       <w:r>
-        <w:t xml:space="preserve">(2003) presented the figure as a model of women’s apostolic and spiritual authority, while insisting—against the popular tradition—that the</w:t>
+        <w:t xml:space="preserve">(2003) presented the figure as a model of women’s apostolic and spiritual authority, while insisting, against the popular tradition, that the</w:t>
       </w:r>
       <w:r>
         <w:t xml:space="preserve"> </w:t>
@@ -3783,7 +3794,7 @@
         <w:t xml:space="preserve"> </w:t>
       </w:r>
       <w:r>
-        <w:t xml:space="preserve">against heresy—because the heretics included women, excluding them became a mode of orthodox self-differentiation.</w:t>
+        <w:t xml:space="preserve">against heresy: because the heretics included women, excluding them became a mode of orthodox self-differentiation.</w:t>
       </w:r>
     </w:p>
     <w:bookmarkEnd w:id="48"/>
@@ -3801,7 +3812,7 @@
         <w:pStyle w:val="FirstParagraph"/>
       </w:pPr>
       <w:r>
-        <w:t xml:space="preserve">What distinguishes the most rigorous strand of this scholarship is that its sharpest correction has come from within. The Pagels-era reading—heterodox Christianity as a suppressed proto-feminism—has been substantially qualified, and largely by feminist scholars themselves.</w:t>
+        <w:t xml:space="preserve">What distinguishes the most rigorous strand of this scholarship is that its sharpest correction has come from within. The Pagels-era reading, heterodox Christianity as a suppressed proto-feminism, has been substantially qualified, and largely by feminist scholars themselves.</w:t>
       </w:r>
     </w:p>
     <w:p>
@@ -3931,7 +3942,7 @@
         <w:t xml:space="preserve"> </w:t>
       </w:r>
       <w:r>
-        <w:t xml:space="preserve">(1988), had already framed the critical question—whether feminine</w:t>
+        <w:t xml:space="preserve">(1988), had already framed the critical question, whether feminine</w:t>
       </w:r>
       <w:r>
         <w:t xml:space="preserve"> </w:t>
@@ -3960,7 +3971,7 @@
         <w:t xml:space="preserve">leadership</w:t>
       </w:r>
       <w:r>
-        <w:t xml:space="preserve">—rather than assuming that such imagery is inherently pro-woman. Third, the historiographical caution: Mary Rose D’Angelo’s</w:t>
+        <w:t xml:space="preserve">, rather than assuming that such imagery is inherently pro-woman. Third, the historiographical caution: Mary Rose D’Angelo’s</w:t>
       </w:r>
       <w:r>
         <w:t xml:space="preserve"> </w:t>
@@ -4032,7 +4043,7 @@
         <w:t xml:space="preserve"> </w:t>
       </w:r>
       <w:r>
-        <w:t xml:space="preserve">owes much to contemporary academic fashion, media sensationalism, and publishers’ incentives, and notes that the non-canonical gospels were generally composed later than the canonical ones. Jenkins’s polemic is itself contested; but its central methodological point—that the antiquity and representativeness of the heterodox texts cannot simply be assumed—has been substantially absorbed. It is worth stressing, against any framing of this debate as feminism versus its conservative critics, that the decisive corrections (King on</w:t>
+        <w:t xml:space="preserve">owes much to contemporary academic fashion, media sensationalism, and publishers’ incentives, and notes that the non-canonical gospels were generally composed later than the canonical ones. Jenkins’s polemic is itself contested; but its central methodological point, that the antiquity and representativeness of the heterodox texts cannot simply be assumed, has been substantially absorbed. It is worth stressing, against any framing of this debate as feminism versus its conservative critics, that the decisive corrections (King on</w:t>
       </w:r>
       <w:r>
         <w:t xml:space="preserve"> </w:t>
@@ -4118,7 +4129,7 @@
         <w:t xml:space="preserve"> </w:t>
       </w:r>
       <w:r>
-        <w:t xml:space="preserve">(1990) reconstructed an active circle of women prophets at Corinth by reading against the grain of Paul’s rhetoric. The shared methodological wager—that women’s agency can be recovered from androcentric texts by reading their silences and their polemics symptomatically—is precisely the wager that the historiographical critics question. It is also what makes the</w:t>
+        <w:t xml:space="preserve">(1990) reconstructed an active circle of women prophets at Corinth by reading against the grain of Paul’s rhetoric. The shared methodological wager, that women’s agency can be recovered from androcentric texts by reading their silences and their polemics symptomatically, is precisely the wager that the historiographical critics question. It is also what makes the</w:t>
       </w:r>
       <w:r>
         <w:t xml:space="preserve"> </w:t>
@@ -4142,7 +4153,7 @@
         <w:pStyle w:val="BodyText"/>
       </w:pPr>
       <w:r>
-        <w:t xml:space="preserve">Reception history confirms the point. The popular afterlife of Mary Magdalene—from the medieval penitent to Dan Brown’s</w:t>
+        <w:t xml:space="preserve">Reception history confirms the point. The popular afterlife of Mary Magdalene, from the medieval penitent to Dan Brown’s</w:t>
       </w:r>
       <w:r>
         <w:t xml:space="preserve"> </w:t>
@@ -4158,7 +4169,7 @@
         <w:t xml:space="preserve"> </w:t>
       </w:r>
       <w:r>
-        <w:t xml:space="preserve">(2003), which revived the legend of a married Magdalene destined to lead the church—demonstrates the figure’s enduring availability as a screen for successive projections. Historians including Bart Ehrman (</w:t>
+        <w:t xml:space="preserve">(2003), which revived the legend of a married Magdalene destined to lead the church, demonstrates the figure’s enduring availability as a screen for successive projections. Historians including Bart Ehrman (</w:t>
       </w:r>
       <w:r>
         <w:rPr>
@@ -4168,7 +4179,7 @@
         <w:t xml:space="preserve">Truth and Fiction in The Da Vinci Code</w:t>
       </w:r>
       <w:r>
-        <w:t xml:space="preserve">, 2004) and Darrell Bock have rebutted the marriage legend—</w:t>
+        <w:t xml:space="preserve">, 2004) and Darrell Bock have rebutted the marriage legend (</w:t>
       </w:r>
       <w:r>
         <w:t xml:space="preserve">“not a single one of our ancient sources indicates that Jesus was married, let alone married to Mary Magdalene,”</w:t>
@@ -4177,7 +4188,7 @@
         <w:t xml:space="preserve"> </w:t>
       </w:r>
       <w:r>
-        <w:t xml:space="preserve">Ehrman observes—and traced the bloodline myth to twentieth-century forgeries later recanted by their author. That the scholarly community has had to expend such effort correcting a novel is itself evidence of how thoroughly Mary Magdalene remains a contested site of cultural memory.</w:t>
+        <w:t xml:space="preserve">Ehrman observes) and traced the bloodline myth to twentieth-century forgeries later recanted by their author. That the scholarly community has had to expend such effort correcting a novel is itself evidence of how thoroughly Mary Magdalene remains a contested site of cultural memory.</w:t>
       </w:r>
     </w:p>
     <w:bookmarkEnd w:id="50"/>
@@ -4196,7 +4207,7 @@
         <w:pStyle w:val="FirstParagraph"/>
       </w:pPr>
       <w:r>
-        <w:t xml:space="preserve">Mary Magdalene’s significance is amplified when she is set within the broader, and likewise contested, record of women’s leadership in the first Christian centuries. The New Testament names a striking number of women as co-workers, patrons, and leaders: alongside Junia the apostle and Phoebe—called both</w:t>
+        <w:t xml:space="preserve">Mary Magdalene’s significance is amplified when she is set within the broader, and likewise contested, record of women’s leadership in the first Christian centuries. The New Testament names a striking number of women as co-workers, patrons, and leaders: alongside Junia the apostle and Phoebe, called both</w:t>
       </w:r>
       <w:r>
         <w:t xml:space="preserve"> </w:t>
@@ -4249,7 +4260,7 @@
         <w:t xml:space="preserve"> </w:t>
       </w:r>
       <w:r>
-        <w:t xml:space="preserve">of many (Romans 16:1–2), and the probable bearer of Paul’s letter to Rome—stand Prisca, who instructed the evangelist Apollos and is named before her husband Aquila in four of six references (Acts 18:24–26); Lydia, Nympha, Chloe, Apphia, and the co-workers Euodia and Syntyche, who</w:t>
+        <w:t xml:space="preserve">of many (Romans 16:1–2), and the probable bearer of Paul’s letter to Rome, stand Prisca, who instructed the evangelist Apollos and is named before her husband Aquila in four of six references (Acts 18:24–26); Lydia, Nympha, Chloe, Apphia, and the co-workers Euodia and Syntyche, who</w:t>
       </w:r>
       <w:r>
         <w:t xml:space="preserve"> </w:t>
@@ -4351,7 +4362,7 @@
         <w:t xml:space="preserve"> </w:t>
       </w:r>
       <w:r>
-        <w:t xml:space="preserve">10.96.8)—a term commonly, though not uncontestedly, understood as the Latin equivalent of the Greek</w:t>
+        <w:t xml:space="preserve">10.96.8), a term commonly, though not uncontestedly, understood as the Latin equivalent of the Greek</w:t>
       </w:r>
       <w:r>
         <w:t xml:space="preserve"> </w:t>
@@ -4660,7 +4671,7 @@
         <w:pStyle w:val="BodyText"/>
       </w:pPr>
       <w:r>
-        <w:t xml:space="preserve">Each of these data points is contested—whether</w:t>
+        <w:t xml:space="preserve">Each of these data points is contested: whether</w:t>
       </w:r>
       <w:r>
         <w:t xml:space="preserve"> </w:t>
@@ -4767,7 +4778,7 @@
         <w:t xml:space="preserve"> </w:t>
       </w:r>
       <w:r>
-        <w:t xml:space="preserve">and—as Schüssler Fiorenza, Eisen, and others observe—the very existence of a prohibition implies a prior practice substantial enough to require suppression. Whether the canons suppressed a robust earlier reality or merely regulated marginal local practice is debated; but on either reading, the institutional memory of women’s authority was being curtailed precisely as it was being committed to writing.</w:t>
+        <w:t xml:space="preserve">and (as Schüssler Fiorenza, Eisen, and others observe) the very existence of a prohibition implies a prior practice substantial enough to require suppression. Whether the canons suppressed a robust earlier reality or merely regulated marginal local practice is debated; but on either reading, the institutional memory of women’s authority was being curtailed precisely as it was being committed to writing.</w:t>
       </w:r>
     </w:p>
     <w:bookmarkEnd w:id="55"/>
@@ -4785,7 +4796,7 @@
         <w:pStyle w:val="FirstParagraph"/>
       </w:pPr>
       <w:r>
-        <w:t xml:space="preserve">Mary Magdalene is, in the end, less a woman about whom we know a great deal than a memory over which a great deal has been contested. The canonical sources give us a patron and disciple from a prosperous Galilean town, a witness to the crucifixion and burial, the first to the empty tomb, and—in Matthew and John—the first to see and to be sent by the risen Christ. Almost everything else is the history of what later generations did with that memory: the third-century intuition that the women at the tomb were</w:t>
+        <w:t xml:space="preserve">Mary Magdalene is, in the end, less a woman about whom we know a great deal than a memory over which a great deal has been contested. The canonical sources give us a patron and disciple from a prosperous Galilean town, a witness to the crucifixion and burial, the first to the empty tomb, and, in Matthew and John, the first to see and to be sent by the risen Christ. Almost everything else is the history of what later generations did with that memory: the third-century intuition that the women at the tomb were</w:t>
       </w:r>
       <w:r>
         <w:t xml:space="preserve"> </w:t>
@@ -6073,7 +6084,7 @@
         <w:t xml:space="preserve"> </w:t>
       </w:r>
       <w:r>
-        <w:t xml:space="preserve">This review synthesises a structured survey of the secondary literature. The reference list and the load-bearing factual claims, dates, and quotations have been independently fact-checked: all thirty-three monographs and all journal-article and primary-source citations (including page ranges, homily and canon numbers, and volume/issue data) were confirmed against catalogue and publisher records, and the principal claims were re-verified against multiple sources. That check corrected several points now reflected in the text—most notably the dating of the</w:t>
+        <w:t xml:space="preserve">This review synthesises a structured survey of the secondary literature. The reference list and the load-bearing factual claims, dates, and quotations have been independently fact-checked: all thirty-three monographs and all journal-article and primary-source citations (including page ranges, homily and canon numbers, and volume/issue data) were confirmed against catalogue and publisher records, and the principal claims were re-verified against multiple sources. That check corrected several points now reflected in the text, most notably the dating of the</w:t>
       </w:r>
       <w:r>
         <w:t xml:space="preserve"> </w:t>
@@ -6230,7 +6241,6 @@
       </w:r>
     </w:p>
     <w:bookmarkEnd w:id="57"/>
-    <w:bookmarkEnd w:id="58"/>
     <w:sectPr>
       <w:footnotePr>
         <w:numRestart w:val="eachSect"/>
@@ -6368,6 +6378,15 @@
   <w:style w:default="1" w:styleId="Normal" w:type="paragraph">
     <w:name w:val="Normal"/>
     <w:qFormat/>
+    <w:pPr>
+      <w:spacing w:after="120" w:line="276" w:lineRule="auto"/>
+      <w:jc w:val="both"/>
+    </w:pPr>
+    <w:rPr>
+      <w:rFonts w:ascii="Times New Roman" w:hAnsi="Times New Roman"/>
+      <w:color w:val="000000"/>
+      <w:sz w:val="24"/>
+    </w:rPr>
   </w:style>
   <w:style w:styleId="BodyText" w:type="paragraph">
     <w:name w:val="Body Text"/>
@@ -6375,14 +6394,29 @@
     <w:link w:val="BodyTextChar"/>
     <w:qFormat/>
     <w:pPr>
-      <w:spacing w:after="180" w:before="180"/>
+      <w:spacing w:after="120" w:before="180" w:line="276" w:lineRule="auto"/>
+      <w:jc w:val="both"/>
     </w:pPr>
+    <w:rPr>
+      <w:rFonts w:ascii="Times New Roman" w:hAnsi="Times New Roman"/>
+      <w:color w:val="000000"/>
+      <w:sz w:val="24"/>
+    </w:rPr>
   </w:style>
   <w:style w:customStyle="1" w:styleId="FirstParagraph" w:type="paragraph">
     <w:name w:val="First Paragraph"/>
     <w:basedOn w:val="BodyText"/>
     <w:next w:val="BodyText"/>
     <w:qFormat/>
+    <w:pPr>
+      <w:spacing w:after="120" w:line="276" w:lineRule="auto"/>
+      <w:jc w:val="both"/>
+    </w:pPr>
+    <w:rPr>
+      <w:rFonts w:ascii="Times New Roman" w:hAnsi="Times New Roman"/>
+      <w:color w:val="000000"/>
+      <w:sz w:val="24"/>
+    </w:rPr>
   </w:style>
   <w:style w:customStyle="1" w:styleId="Compact" w:type="paragraph">
     <w:name w:val="Compact"/>
@@ -6401,13 +6435,15 @@
     <w:qFormat/>
     <w:rsid w:val="00A10FD9"/>
     <w:pPr>
-      <w:spacing w:after="80" w:line="240" w:lineRule="auto"/>
+      <w:spacing w:after="280" w:before="0" w:line="264" w:lineRule="auto"/>
       <w:contextualSpacing/>
       <w:jc w:val="center"/>
     </w:pPr>
     <w:rPr>
-      <w:rFonts w:asciiTheme="majorHAnsi" w:cstheme="majorBidi" w:eastAsiaTheme="majorEastAsia" w:hAnsiTheme="majorHAnsi"/>
-      <w:sz w:val="56"/>
+      <w:rFonts w:ascii="Times New Roman" w:asciiTheme="majorHAnsi" w:cstheme="majorBidi" w:eastAsiaTheme="majorEastAsia" w:hAnsi="Times New Roman" w:hAnsiTheme="majorHAnsi"/>
+      <w:b/>
+      <w:color w:val="000000"/>
+      <w:sz w:val="34"/>
       <w:szCs w:val="56"/>
     </w:rPr>
   </w:style>
@@ -6536,13 +6572,16 @@
     <w:pPr>
       <w:keepNext/>
       <w:keepLines/>
-      <w:spacing w:after="80" w:before="360"/>
+      <w:spacing w:after="120" w:before="320" w:line="240" w:lineRule="auto"/>
+      <w:jc w:val="left"/>
       <w:outlineLvl w:val="0"/>
     </w:pPr>
     <w:rPr>
-      <w:rFonts w:asciiTheme="majorHAnsi" w:cstheme="majorBidi" w:eastAsiaTheme="majorEastAsia" w:hAnsiTheme="majorHAnsi"/>
-      <w:color w:themeColor="accent1" w:themeShade="BF" w:val="0F4761"/>
-      <w:sz w:val="40"/>
+      <w:rFonts w:ascii="Times New Roman" w:asciiTheme="majorHAnsi" w:cstheme="majorBidi" w:eastAsiaTheme="majorEastAsia" w:hAnsi="Times New Roman" w:hAnsiTheme="majorHAnsi"/>
+      <w:b/>
+      <w:i w:val="0"/>
+      <w:color w:val="000000"/>
+      <w:sz w:val="30"/>
       <w:szCs w:val="40"/>
     </w:rPr>
   </w:style>
@@ -6559,13 +6598,16 @@
     <w:pPr>
       <w:keepNext/>
       <w:keepLines/>
-      <w:spacing w:after="80" w:before="160"/>
+      <w:spacing w:after="100" w:before="280" w:line="240" w:lineRule="auto"/>
+      <w:jc w:val="left"/>
       <w:outlineLvl w:val="1"/>
     </w:pPr>
     <w:rPr>
-      <w:rFonts w:asciiTheme="majorHAnsi" w:cstheme="majorBidi" w:eastAsiaTheme="majorEastAsia" w:hAnsiTheme="majorHAnsi"/>
-      <w:color w:themeColor="accent1" w:themeShade="BF" w:val="0F4761"/>
-      <w:sz w:val="32"/>
+      <w:rFonts w:ascii="Times New Roman" w:asciiTheme="majorHAnsi" w:cstheme="majorBidi" w:eastAsiaTheme="majorEastAsia" w:hAnsi="Times New Roman" w:hAnsiTheme="majorHAnsi"/>
+      <w:b/>
+      <w:i w:val="0"/>
+      <w:color w:val="000000"/>
+      <w:sz w:val="27"/>
       <w:szCs w:val="32"/>
     </w:rPr>
   </w:style>
@@ -6582,13 +6624,16 @@
     <w:pPr>
       <w:keepNext/>
       <w:keepLines/>
-      <w:spacing w:after="80" w:before="160"/>
+      <w:spacing w:after="80" w:before="200" w:line="240" w:lineRule="auto"/>
+      <w:jc w:val="left"/>
       <w:outlineLvl w:val="2"/>
     </w:pPr>
     <w:rPr>
-      <w:rFonts w:cstheme="majorBidi" w:eastAsiaTheme="majorEastAsia"/>
-      <w:color w:themeColor="accent1" w:themeShade="BF" w:val="0F4761"/>
-      <w:sz w:val="28"/>
+      <w:rFonts w:ascii="Times New Roman" w:cstheme="majorBidi" w:eastAsiaTheme="majorEastAsia" w:hAnsi="Times New Roman"/>
+      <w:b/>
+      <w:i/>
+      <w:color w:val="000000"/>
+      <w:sz w:val="24"/>
       <w:szCs w:val="28"/>
     </w:rPr>
   </w:style>

</xml_diff>